<commit_message>
Refactor KIO task types and integrate new KPIs for KIO3 and KIO4
- Updated docker-compose.yml to rename KIO_TASK_TYPE for kio3 from "test-generation" to "nlp-requirements" and for kio4 from "debug" to "architecture-to-code".
- Added new environment variable KIO_REAL_KPI_ROLE for kio3 and kio4 to align with D1.1 KPI roles.
- Created new documentation file AI4SWENG_KPI_Metrik_Referansi_v1.2.docx to include updated KPI metrics for KIO3 and KIO4.
- Enhanced Grafana dashboard to include new KPI panels for KIO3 and KIO4, reflecting their respective roles and metrics.
- Modified kio_simulator.py to emit metrics for code generation speed, code quality improvement, and review score based on the new KIO roles.
- Updated README.md to reference the new KPI documentation version.
- Adjusted planner.py routing table to use updated task types for KIO3 and KIO4.
</commit_message>
<xml_diff>
--- a/docs/AI4SWENG_Observability_Teknik_Rapor_v1.4.docx
+++ b/docs/AI4SWENG_Observability_Teknik_Rapor_v1.4.docx
@@ -159,6 +159,8 @@
       <w:r>
         <w:t>Sistem beş katmandan oluşur: (1) KIO modülleri (üretici), (2) OpenTelemetry Collector (yönlendirici), (3) VictoriaMetrics (metrik deposu), (4) VictoriaLogs (yapısal olmayan / string veri deposu), (5) Grafana (görselleştirme). Tüm bileşenler tek bir Docker Compose dosyasıyla, geliştiricinin kendi bilgisayarında ayağa kalkar.</w:t>
       </w:r>
+      <w:bookmarkStart w:id="0" w:name="_GoBack"/>
+      <w:bookmarkEnd w:id="0"/>
     </w:p>
     <w:p>
       <w:pPr>
@@ -4969,12 +4971,6 @@
             <w:insideH w:val="single" w:color="auto" w:sz="4" w:space="0"/>
             <w:insideV w:val="single" w:color="auto" w:sz="4" w:space="0"/>
           </w:tblBorders>
-          <w:tblCellMar>
-            <w:top w:w="0" w:type="dxa"/>
-            <w:left w:w="10" w:type="dxa"/>
-            <w:bottom w:w="0" w:type="dxa"/>
-            <w:right w:w="10" w:type="dxa"/>
-          </w:tblCellMar>
         </w:tblPrEx>
         <w:trPr>
           <w:tblHeader/>
@@ -9260,12 +9256,10 @@
         <w:spacing w:after="140"/>
         <w:jc w:val="both"/>
       </w:pPr>
-      <w:bookmarkStart w:id="0" w:name="_GoBack"/>
       <w:r>
         <w:t>Grafana'ya http://localhost:3000 adresinden erişilir (admin / admin, anonim erişim de açık). İlk metriklerin görünmesi için ~30-60 saniye beklenmelidir. Sistemi tamamen kapatıp veriyi silmek için: docker compose down -v.</w:t>
       </w:r>
     </w:p>
-    <w:bookmarkEnd w:id="0"/>
     <w:p>
       <w:pPr>
         <w:pStyle w:val="2"/>
@@ -9709,6 +9703,9 @@
             <w:vAlign w:val="center"/>
           </w:tcPr>
           <w:p>
+            <w:pPr>
+              <w:jc w:val="both"/>
+            </w:pPr>
             <w:r>
               <w:rPr>
                 <w:b w:val="0"/>
@@ -9802,6 +9799,9 @@
             <w:vAlign w:val="center"/>
           </w:tcPr>
           <w:p>
+            <w:pPr>
+              <w:jc w:val="both"/>
+            </w:pPr>
             <w:r>
               <w:rPr>
                 <w:b w:val="0"/>
@@ -9892,6 +9892,9 @@
             <w:vAlign w:val="center"/>
           </w:tcPr>
           <w:p>
+            <w:pPr>
+              <w:jc w:val="both"/>
+            </w:pPr>
             <w:r>
               <w:rPr>
                 <w:b w:val="0"/>
@@ -9985,6 +9988,9 @@
             <w:vAlign w:val="center"/>
           </w:tcPr>
           <w:p>
+            <w:pPr>
+              <w:jc w:val="both"/>
+            </w:pPr>
             <w:r>
               <w:rPr>
                 <w:b w:val="0"/>
@@ -10078,6 +10084,9 @@
             <w:vAlign w:val="center"/>
           </w:tcPr>
           <w:p>
+            <w:pPr>
+              <w:jc w:val="both"/>
+            </w:pPr>
             <w:r>
               <w:rPr>
                 <w:b w:val="0"/>
@@ -10271,7 +10280,7 @@
     <w:lsdException w:unhideWhenUsed="0" w:uiPriority="0" w:semiHidden="0" w:name="toc 8"/>
     <w:lsdException w:unhideWhenUsed="0" w:uiPriority="0" w:semiHidden="0" w:name="toc 9"/>
     <w:lsdException w:unhideWhenUsed="0" w:uiPriority="0" w:semiHidden="0" w:name="Normal Indent"/>
-    <w:lsdException w:uiPriority="99" w:name="footnote text"/>
+    <w:lsdException w:qFormat="1" w:uiPriority="99" w:name="footnote text"/>
     <w:lsdException w:unhideWhenUsed="0" w:uiPriority="0" w:semiHidden="0" w:name="annotation text"/>
     <w:lsdException w:unhideWhenUsed="0" w:uiPriority="0" w:semiHidden="0" w:name="header"/>
     <w:lsdException w:unhideWhenUsed="0" w:uiPriority="0" w:semiHidden="0" w:name="footer"/>
@@ -10280,12 +10289,12 @@
     <w:lsdException w:unhideWhenUsed="0" w:uiPriority="0" w:semiHidden="0" w:name="table of figures"/>
     <w:lsdException w:unhideWhenUsed="0" w:uiPriority="0" w:semiHidden="0" w:name="envelope address"/>
     <w:lsdException w:unhideWhenUsed="0" w:uiPriority="0" w:semiHidden="0" w:name="envelope return"/>
-    <w:lsdException w:uiPriority="99" w:name="footnote reference"/>
+    <w:lsdException w:qFormat="1" w:uiPriority="99" w:name="footnote reference"/>
     <w:lsdException w:unhideWhenUsed="0" w:uiPriority="0" w:semiHidden="0" w:name="annotation reference"/>
     <w:lsdException w:unhideWhenUsed="0" w:uiPriority="0" w:semiHidden="0" w:name="line number"/>
     <w:lsdException w:unhideWhenUsed="0" w:uiPriority="0" w:semiHidden="0" w:name="page number"/>
-    <w:lsdException w:uiPriority="99" w:name="endnote reference"/>
-    <w:lsdException w:uiPriority="99" w:name="endnote text"/>
+    <w:lsdException w:qFormat="1" w:uiPriority="99" w:name="endnote reference"/>
+    <w:lsdException w:qFormat="1" w:uiPriority="99" w:name="endnote text"/>
     <w:lsdException w:unhideWhenUsed="0" w:uiPriority="0" w:semiHidden="0" w:name="table of authorities"/>
     <w:lsdException w:unhideWhenUsed="0" w:uiPriority="0" w:semiHidden="0" w:name="macro"/>
     <w:lsdException w:unhideWhenUsed="0" w:uiPriority="0" w:semiHidden="0" w:name="toa heading"/>
@@ -10307,7 +10316,7 @@
     <w:lsdException w:qFormat="1" w:unhideWhenUsed="0" w:uiPriority="0" w:semiHidden="0" w:name="Title"/>
     <w:lsdException w:unhideWhenUsed="0" w:uiPriority="0" w:semiHidden="0" w:name="Closing"/>
     <w:lsdException w:unhideWhenUsed="0" w:uiPriority="0" w:semiHidden="0" w:name="Signature"/>
-    <w:lsdException w:unhideWhenUsed="0" w:uiPriority="0" w:name="Default Paragraph Font"/>
+    <w:lsdException w:qFormat="1" w:unhideWhenUsed="0" w:uiPriority="0" w:name="Default Paragraph Font"/>
     <w:lsdException w:unhideWhenUsed="0" w:uiPriority="0" w:semiHidden="0" w:name="Body Text"/>
     <w:lsdException w:unhideWhenUsed="0" w:uiPriority="0" w:semiHidden="0" w:name="Body Text Indent"/>
     <w:lsdException w:unhideWhenUsed="0" w:uiPriority="0" w:semiHidden="0" w:name="List Continue"/>
@@ -10327,7 +10336,7 @@
     <w:lsdException w:unhideWhenUsed="0" w:uiPriority="0" w:semiHidden="0" w:name="Body Text Indent 2"/>
     <w:lsdException w:unhideWhenUsed="0" w:uiPriority="0" w:semiHidden="0" w:name="Body Text Indent 3"/>
     <w:lsdException w:unhideWhenUsed="0" w:uiPriority="0" w:semiHidden="0" w:name="Block Text"/>
-    <w:lsdException w:uiPriority="99" w:semiHidden="0" w:name="Hyperlink"/>
+    <w:lsdException w:qFormat="1" w:uiPriority="99" w:semiHidden="0" w:name="Hyperlink"/>
     <w:lsdException w:unhideWhenUsed="0" w:uiPriority="0" w:semiHidden="0" w:name="FollowedHyperlink"/>
     <w:lsdException w:qFormat="1" w:unhideWhenUsed="0" w:uiPriority="0" w:semiHidden="0" w:name="Strong"/>
     <w:lsdException w:qFormat="1" w:unhideWhenUsed="0" w:uiPriority="0" w:semiHidden="0" w:name="Emphasis"/>
@@ -10593,6 +10602,7 @@
   <w:style w:type="character" w:default="1" w:styleId="8">
     <w:name w:val="Default Paragraph Font"/>
     <w:semiHidden/>
+    <w:qFormat/>
     <w:uiPriority w:val="0"/>
   </w:style>
   <w:style w:type="table" w:default="1" w:styleId="9">
@@ -10612,6 +10622,7 @@
     <w:name w:val="endnote reference"/>
     <w:semiHidden/>
     <w:unhideWhenUsed/>
+    <w:qFormat/>
     <w:uiPriority w:val="99"/>
     <w:rPr>
       <w:vertAlign w:val="superscript"/>
@@ -10622,6 +10633,7 @@
     <w:link w:val="18"/>
     <w:semiHidden/>
     <w:unhideWhenUsed/>
+    <w:qFormat/>
     <w:uiPriority w:val="99"/>
     <w:pPr>
       <w:spacing w:after="0" w:line="240" w:lineRule="auto"/>
@@ -10637,6 +10649,7 @@
     <w:name w:val="footnote reference"/>
     <w:semiHidden/>
     <w:unhideWhenUsed/>
+    <w:qFormat/>
     <w:uiPriority w:val="99"/>
     <w:rPr>
       <w:vertAlign w:val="superscript"/>
@@ -10647,6 +10660,7 @@
     <w:link w:val="17"/>
     <w:semiHidden/>
     <w:unhideWhenUsed/>
+    <w:qFormat/>
     <w:uiPriority w:val="99"/>
     <w:pPr>
       <w:spacing w:after="0" w:line="240" w:lineRule="auto"/>
@@ -10661,6 +10675,7 @@
   <w:style w:type="character" w:styleId="14">
     <w:name w:val="Hyperlink"/>
     <w:unhideWhenUsed/>
+    <w:qFormat/>
     <w:uiPriority w:val="99"/>
     <w:rPr>
       <w:color w:val="0563C1"/>
@@ -10694,6 +10709,7 @@
     <w:link w:val="13"/>
     <w:semiHidden/>
     <w:unhideWhenUsed/>
+    <w:qFormat/>
     <w:uiPriority w:val="99"/>
     <w:rPr>
       <w:sz w:val="20"/>
@@ -10705,6 +10721,7 @@
     <w:link w:val="11"/>
     <w:semiHidden/>
     <w:unhideWhenUsed/>
+    <w:qFormat/>
     <w:uiPriority w:val="99"/>
     <w:rPr>
       <w:sz w:val="20"/>

</xml_diff>